<commit_message>
Align paper with actual Tavola 1/2/3 boards (scales, levels, tiers, zoning)
- fixed drawing scales to the real boards: 1:7500 (site plan), 1:750 (cluster
  zoning & anchoring), 1:500 (geometric prototyping), 1:1000 (structural
  elevation), 1:100 (section A-A), 1:150 (interior) — was 1:1500/1:750/1:80
- pod section rewritten to match Tavola 3: 3 floors (Ground/Entry+Technical,
  First/Research+Interactive, Second/Residential+Wellness) across datums
  +0.00/+8.00/+16.00/+24.00 m
- added Tavola 2 cluster content: 4 zoning sectors + tier stratification
  +0/+24/+48/+72/+96 m (four spatial tiers +24 to +96 m)
- summary table updated with scales, tier datums, zoning and floor names

Co-authored-by: arena-agent <297053741+arena-agent@users.noreply.github.com>
</commit_message>
<xml_diff>
--- a/The Arctic Lens — Combined Paper (EN).docx
+++ b/The Arctic Lens — Combined Paper (EN).docx
@@ -453,7 +453,7 @@
           <w:b/>
           <w:i w:val="0"/>
         </w:rPr>
-        <w:t>Land Access (Territorial Master Plan — Scale 1:1500):</w:t>
+        <w:t>Land Access (Territorial Master Plan — Tavola 1, Scale 1:7500):</w:t>
       </w:r>
       <w:r>
         <w:rPr>
@@ -585,7 +585,7 @@
           <w:b/>
           <w:sz w:val="24"/>
         </w:rPr>
-        <w:t>4.1 Pod Sectional Stratification (Tavola 3 — Section A-A', Scale 1:80)</w:t>
+        <w:t>4.1 Cluster Zoning and Tier Stratification (Tavola 2)</w:t>
       </w:r>
     </w:p>
     <w:p>
@@ -594,7 +594,7 @@
           <w:b w:val="0"/>
           <w:i w:val="0"/>
         </w:rPr>
-        <w:t>To align with the master drawing panels, the vertical domain of the cluster and its primary pod sections are stratified across four primary elevation datums:</w:t>
+        <w:t>The 32 pods are not distributed uniformly: the cluster is organized into four functional sectors and rises through four main spatial tiers:</w:t>
       </w:r>
     </w:p>
     <w:p>
@@ -606,14 +606,14 @@
           <w:b/>
           <w:i w:val="0"/>
         </w:rPr>
-        <w:t>Level +0.00 m (Life-Support &amp; Technical Base):</w:t>
+        <w:t>Cluster Zoning (Tavola 2, Scale 1:750):</w:t>
       </w:r>
       <w:r>
         <w:rPr>
           <w:b w:val="0"/>
           <w:i w:val="0"/>
         </w:rPr>
-        <w:t xml:space="preserve"> Encloses high-pressure environmental airlocks, storage, greywater recycling loops, power distribution, and seawater heat-pump units drawing +4°C to +6°C thermal energy from a sea depth of 15 m.</w:t>
+        <w:t xml:space="preserve"> the matrix is zoned into four sectors — The Core Research Nucleus, The Logistics / Life-Support System, The Habitat &amp; Biosphere, and The Eco-Cultivation.</w:t>
       </w:r>
     </w:p>
     <w:p>
@@ -625,14 +625,44 @@
           <w:b/>
           <w:i w:val="0"/>
         </w:rPr>
-        <w:t>Level +8.00 m (Research &amp; Active Bio-Commons):</w:t>
+        <w:t>Tier Stratification (Tavola 2):</w:t>
       </w:r>
       <w:r>
         <w:rPr>
           <w:b w:val="0"/>
           <w:i w:val="0"/>
         </w:rPr>
-        <w:t xml:space="preserve"> Houses climate-controlled hydro-gardens/aquaponics, active scientific workstations, wet labs, and micro-vegetation terraces (150 mm clay aggregate soil growing dwarf polar willow and mosses).</w:t>
+        <w:t xml:space="preserve"> the modules are distributed across four main spatial tiers, from +24.00 m to +96.00 m, with the level stratification marked at +0.00 / +24.00 / +48.00 / +72.00 / +96.00 m.</w:t>
+      </w:r>
+    </w:p>
+    <w:p>
+      <w:r>
+        <w:rPr>
+          <w:b w:val="0"/>
+          <w:i w:val="0"/>
+        </w:rPr>
+        <w:t>This stratification maximizes natural illumination and aerodynamic wind mitigation while preserving the floating, structural equilibrium of the whole.</w:t>
+      </w:r>
+    </w:p>
+    <w:p>
+      <w:pPr>
+        <w:spacing w:before="200" w:after="80"/>
+      </w:pPr>
+      <w:r>
+        <w:rPr>
+          <w:b/>
+          <w:sz w:val="24"/>
+        </w:rPr>
+        <w:t>4.2 Pod Sectional Stratification (Tavola 3 — Section A-A, Scale 1:100)</w:t>
+      </w:r>
+    </w:p>
+    <w:p>
+      <w:r>
+        <w:rPr>
+          <w:b w:val="0"/>
+          <w:i w:val="0"/>
+        </w:rPr>
+        <w:t>Within each pod, the vertical axis is stratified across three floors, each rising 8 m between the four primary elevation datums (+0.00 / +8.00 / +16.00 / +24.00 m):</w:t>
       </w:r>
     </w:p>
     <w:p>
@@ -644,14 +674,14 @@
           <w:b/>
           <w:i w:val="0"/>
         </w:rPr>
-        <w:t>Level +16.00 m (Equatorial Social Core &amp; Living Quarters):</w:t>
+        <w:t>Lower Level (+0.00 m to +8.00 m) — Ground Floor (Entry &amp; Technical Core):</w:t>
       </w:r>
       <w:r>
         <w:rPr>
           <w:b w:val="0"/>
           <w:i w:val="0"/>
         </w:rPr>
-        <w:t xml:space="preserve"> Dedicated to crew accommodation pods, communal dining lounges, quiet study spaces, and archival library habitats connected face-to-face via the Ø3,600 mm open portals.</w:t>
+        <w:t xml:space="preserve"> the pressurized environmental Air Lock, Lobby/Entry, Provisions/Storage, and the MEP life-support systems — together with the seawater heat-pump units drawing +4°C to +6°C thermal energy from a sea depth of 15 m. This is the pod's primary structural and mechanical base.</w:t>
       </w:r>
     </w:p>
     <w:p>
@@ -663,14 +693,33 @@
           <w:b/>
           <w:i w:val="0"/>
         </w:rPr>
-        <w:t>Level +24.00 m (Celestial Sanctuary &amp; Upper Apex Lens):</w:t>
+        <w:t>Mid Level (+8.00 m to +16.00 m) — First Floor (Research &amp; Interactive Zone):</w:t>
       </w:r>
       <w:r>
         <w:rPr>
           <w:b w:val="0"/>
           <w:i w:val="0"/>
         </w:rPr>
-        <w:t xml:space="preserve"> The uppermost residential refuge under the polyhedral dome, capped by a 100% unfritted, crystal-clear 7.3 m ETFE zenith lens. It operates as a living sundial during the summer Midnight Sun and an unobstructed viewing dome for the Aurora Borealis in winter.</w:t>
+        <w:t xml:space="preserve"> the active scientific domain — a Wet Lab for environmental sampling, a Dry Lab &amp; IT Server Core, climate-controlled Hydro-Gardens/aquaponics for biological sustainment, and a central Collaboration Space.</w:t>
+      </w:r>
+    </w:p>
+    <w:p>
+      <w:pPr>
+        <w:pStyle w:val="ListBullet"/>
+      </w:pPr>
+      <w:r>
+        <w:rPr>
+          <w:b/>
+          <w:i w:val="0"/>
+        </w:rPr>
+        <w:t>Upper Level (+16.00 m to +24.00 m) — Second Floor (Residential &amp; Wellness Habitat):</w:t>
+      </w:r>
+      <w:r>
+        <w:rPr>
+          <w:b w:val="0"/>
+          <w:i w:val="0"/>
+        </w:rPr>
+        <w:t xml:space="preserve"> the uppermost private tier optimized for crew well-being — compact Sleeping Quarters, a Kitchenette &amp; Dining zone, bathroom facilities, a Wellness area, and a central Quiet Lounge — capped by the transparent polyhedral dome and its unfritted 7.3 m ETFE zenith lens, which operates as a living sundial under the Midnight Sun and a viewing dome for the Aurora Borealis in winter.</w:t>
       </w:r>
     </w:p>
     <w:p>
@@ -682,7 +731,7 @@
           <w:b/>
           <w:sz w:val="24"/>
         </w:rPr>
-        <w:t>4.2 Structural Anchoring &amp; Cable Network (Tavola 2 — Scale 1:750)</w:t>
+        <w:t>4.3 Structural Anchoring &amp; Cable Network (Tavola 2 — Scale 1:750)</w:t>
       </w:r>
     </w:p>
     <w:p>
@@ -1020,7 +1069,7 @@
           <w:p>
             <w:r/>
             <w:r>
-              <w:t>Tavola 1 (Masterplan)</w:t>
+              <w:t>Tavola 1 (Site Plan)</w:t>
             </w:r>
           </w:p>
         </w:tc>
@@ -1036,7 +1085,7 @@
               <w:rPr>
                 <w:b/>
               </w:rPr>
-              <w:t>Primary Drawing Scales</w:t>
+              <w:t>Drawing Scales</w:t>
             </w:r>
           </w:p>
         </w:tc>
@@ -1047,7 +1096,7 @@
           <w:p>
             <w:r/>
             <w:r>
-              <w:t>1:1500 (Masterplan), 1:750 (Anchoring), 1:80 (Section)</w:t>
+              <w:t>1:7500 (Site Plan) · 1:750 (Cluster Zoning &amp; Anchoring) · 1:500 (Geometric Prototyping) · 1:1000 (Structural Elevation) · 1:100 (Pod Section A-A) · 1:150 (Interior)</w:t>
             </w:r>
           </w:p>
         </w:tc>
@@ -1059,6 +1108,82 @@
             <w:r/>
             <w:r>
               <w:t>Tavola 1, 2, 3 Title Blocks</w:t>
+            </w:r>
+          </w:p>
+        </w:tc>
+      </w:tr>
+      <w:tr>
+        <w:tc>
+          <w:tcPr>
+            <w:tcW w:type="dxa" w:w="2880"/>
+          </w:tcPr>
+          <w:p>
+            <w:r/>
+            <w:r>
+              <w:rPr>
+                <w:b/>
+              </w:rPr>
+              <w:t>Cluster Tier Stratification</w:t>
+            </w:r>
+          </w:p>
+        </w:tc>
+        <w:tc>
+          <w:tcPr>
+            <w:tcW w:type="dxa" w:w="2880"/>
+          </w:tcPr>
+          <w:p>
+            <w:r/>
+            <w:r>
+              <w:t>+0.00 / +24.00 / +48.00 / +72.00 / +96.00 m (four spatial tiers +24 to +96 m)</w:t>
+            </w:r>
+          </w:p>
+        </w:tc>
+        <w:tc>
+          <w:tcPr>
+            <w:tcW w:type="dxa" w:w="2880"/>
+          </w:tcPr>
+          <w:p>
+            <w:r/>
+            <w:r>
+              <w:t>Tavola 2 (Level Stratification)</w:t>
+            </w:r>
+          </w:p>
+        </w:tc>
+      </w:tr>
+      <w:tr>
+        <w:tc>
+          <w:tcPr>
+            <w:tcW w:type="dxa" w:w="2880"/>
+          </w:tcPr>
+          <w:p>
+            <w:r/>
+            <w:r>
+              <w:rPr>
+                <w:b/>
+              </w:rPr>
+              <w:t>Cluster Zoning</w:t>
+            </w:r>
+          </w:p>
+        </w:tc>
+        <w:tc>
+          <w:tcPr>
+            <w:tcW w:type="dxa" w:w="2880"/>
+          </w:tcPr>
+          <w:p>
+            <w:r/>
+            <w:r>
+              <w:t>Core Research Nucleus · Logistics/Life-Support · Habitat &amp; Biosphere · Eco-Cultivation</w:t>
+            </w:r>
+          </w:p>
+        </w:tc>
+        <w:tc>
+          <w:tcPr>
+            <w:tcW w:type="dxa" w:w="2880"/>
+          </w:tcPr>
+          <w:p>
+            <w:r/>
+            <w:r>
+              <w:t>Tavola 2 (Cluster Zoning)</w:t>
             </w:r>
           </w:p>
         </w:tc>
@@ -1134,7 +1259,45 @@
           <w:p>
             <w:r/>
             <w:r>
-              <w:t>Tavola 2 &amp; 3 Datums</w:t>
+              <w:t>Tavola 3 (Section A-A)</w:t>
+            </w:r>
+          </w:p>
+        </w:tc>
+      </w:tr>
+      <w:tr>
+        <w:tc>
+          <w:tcPr>
+            <w:tcW w:type="dxa" w:w="2880"/>
+          </w:tcPr>
+          <w:p>
+            <w:r/>
+            <w:r>
+              <w:rPr>
+                <w:b/>
+              </w:rPr>
+              <w:t>Pod Floors</w:t>
+            </w:r>
+          </w:p>
+        </w:tc>
+        <w:tc>
+          <w:tcPr>
+            <w:tcW w:type="dxa" w:w="2880"/>
+          </w:tcPr>
+          <w:p>
+            <w:r/>
+            <w:r>
+              <w:t>Ground (Entry &amp; Technical) · First (Research &amp; Interactive) · Second (Residential &amp; Wellness)</w:t>
+            </w:r>
+          </w:p>
+        </w:tc>
+        <w:tc>
+          <w:tcPr>
+            <w:tcW w:type="dxa" w:w="2880"/>
+          </w:tcPr>
+          <w:p>
+            <w:r/>
+            <w:r>
+              <w:t>Tavola 3 (Section A-A)</w:t>
             </w:r>
           </w:p>
         </w:tc>

</xml_diff>